<commit_message>
Update data processing documentation
Refresh the data processing documentation to include the latest revisions and approved content updates.
</commit_message>
<xml_diff>
--- a/lab_1/Data Processing Documentation.docx
+++ b/lab_1/Data Processing Documentation.docx
@@ -18,6 +18,40 @@
         <w:t>Data Processing Documentation</w:t>
       </w:r>
     </w:p>
+    <w:p>
+      <w:pPr>
+        <w:rPr>
+          <w:sz w:val="32"/>
+          <w:szCs w:val="32"/>
+        </w:rPr>
+      </w:pPr>
+    </w:p>
+    <w:p>
+      <w:pPr>
+        <w:ind w:firstLine="720"/>
+      </w:pPr>
+      <w:r>
+        <w:t xml:space="preserve">This </w:t>
+      </w:r>
+      <w:r>
+        <w:t>mini language</w:t>
+      </w:r>
+      <w:r>
+        <w:t xml:space="preserve"> is designed for easier data processing using arrays. It contains statements for the most common processing steps that are called on an array. A </w:t>
+      </w:r>
+      <w:r>
+        <w:t>typical program</w:t>
+      </w:r>
+      <w:r>
+        <w:t xml:space="preserve"> loads a dataset from a file, cleans it, computes it, and saves </w:t>
+      </w:r>
+      <w:r>
+        <w:t>it</w:t>
+      </w:r>
+      <w:r>
+        <w:t>. For loops and if statements indentation works just like in Python.</w:t>
+      </w:r>
+    </w:p>
     <w:p/>
     <w:p>
       <w:r>
@@ -43,7 +77,7 @@
       </w:r>
       <w:proofErr w:type="gramEnd"/>
       <w:r>
-        <w:t>0] = 5;</w:t>
+        <w:t>0] = 5</w:t>
       </w:r>
     </w:p>
     <w:p>
@@ -257,6 +291,7 @@
           <w:b/>
           <w:bCs/>
         </w:rPr>
+        <w:lastRenderedPageBreak/>
         <w:t>Sort</w:t>
       </w:r>
       <w:r>
@@ -309,87 +344,357 @@
           <w:b/>
           <w:bCs/>
         </w:rPr>
+        <w:t>Reverse</w:t>
+      </w:r>
+      <w:r>
+        <w:t xml:space="preserve"> -&gt; flips the order of the elements.</w:t>
+      </w:r>
+    </w:p>
+    <w:p>
+      <w:r>
+        <w:t xml:space="preserve">reverse </w:t>
+      </w:r>
+      <w:proofErr w:type="spellStart"/>
+      <w:r>
+        <w:t>arr</w:t>
+      </w:r>
+      <w:proofErr w:type="spellEnd"/>
+    </w:p>
+    <w:p>
+      <w:r>
+        <w:rPr>
+          <w:b/>
+          <w:bCs/>
+        </w:rPr>
+        <w:t>Append</w:t>
+      </w:r>
+      <w:r>
+        <w:t xml:space="preserve"> -&gt; adds new values at the end as they arrive.</w:t>
+      </w:r>
+    </w:p>
+    <w:p>
+      <w:proofErr w:type="spellStart"/>
+      <w:proofErr w:type="gramStart"/>
+      <w:r>
+        <w:t>arr.append</w:t>
+      </w:r>
+      <w:proofErr w:type="spellEnd"/>
+      <w:proofErr w:type="gramEnd"/>
+      <w:r>
+        <w:t>(7)</w:t>
+      </w:r>
+    </w:p>
+    <w:p>
+      <w:r>
+        <w:rPr>
+          <w:b/>
+          <w:bCs/>
+        </w:rPr>
+        <w:t>Insert</w:t>
+      </w:r>
+      <w:r>
+        <w:t xml:space="preserve"> -&gt; puts a value at a given position.</w:t>
+      </w:r>
+    </w:p>
+    <w:p>
+      <w:r>
+        <w:t xml:space="preserve">insert </w:t>
+      </w:r>
+      <w:proofErr w:type="spellStart"/>
+      <w:r>
+        <w:t>arr</w:t>
+      </w:r>
+      <w:proofErr w:type="spellEnd"/>
+      <w:r>
+        <w:t xml:space="preserve"> 1 99</w:t>
+      </w:r>
+    </w:p>
+    <w:p>
+      <w:r>
+        <w:rPr>
+          <w:b/>
+          <w:bCs/>
+        </w:rPr>
+        <w:t>Remove</w:t>
+      </w:r>
+      <w:r>
+        <w:t xml:space="preserve"> -&gt; deletes the element at a given position.</w:t>
+      </w:r>
+    </w:p>
+    <w:p>
+      <w:r>
+        <w:t xml:space="preserve">remove </w:t>
+      </w:r>
+      <w:proofErr w:type="spellStart"/>
+      <w:r>
+        <w:t>arr</w:t>
+      </w:r>
+      <w:proofErr w:type="spellEnd"/>
+      <w:r>
+        <w:t xml:space="preserve"> 0</w:t>
+      </w:r>
+    </w:p>
+    <w:p>
+      <w:proofErr w:type="spellStart"/>
+      <w:r>
+        <w:rPr>
+          <w:b/>
+          <w:bCs/>
+        </w:rPr>
+        <w:t>Concat</w:t>
+      </w:r>
+      <w:proofErr w:type="spellEnd"/>
+      <w:r>
+        <w:t xml:space="preserve"> -&gt; adds all elements of b to the end of a, to merge two data sets.</w:t>
+      </w:r>
+    </w:p>
+    <w:p>
+      <w:proofErr w:type="spellStart"/>
+      <w:r>
+        <w:t>concat</w:t>
+      </w:r>
+      <w:proofErr w:type="spellEnd"/>
+      <w:r>
+        <w:t xml:space="preserve"> a b</w:t>
+      </w:r>
+    </w:p>
+    <w:p>
+      <w:r>
+        <w:rPr>
+          <w:b/>
+          <w:bCs/>
+        </w:rPr>
+        <w:t>Copy</w:t>
+      </w:r>
+      <w:r>
+        <w:t xml:space="preserve"> -&gt; copies </w:t>
+      </w:r>
+      <w:proofErr w:type="spellStart"/>
+      <w:r>
+        <w:t>a</w:t>
+      </w:r>
+      <w:proofErr w:type="spellEnd"/>
+      <w:r>
+        <w:t xml:space="preserve"> into b, so the original stays safe.</w:t>
+      </w:r>
+    </w:p>
+    <w:p>
+      <w:r>
+        <w:t>copy a b</w:t>
+      </w:r>
+    </w:p>
+    <w:p>
+      <w:r>
+        <w:rPr>
+          <w:b/>
+          <w:bCs/>
+        </w:rPr>
+        <w:t>Clear</w:t>
+      </w:r>
+      <w:r>
+        <w:t xml:space="preserve"> -&gt; empties an array so it can be reused.</w:t>
+      </w:r>
+    </w:p>
+    <w:p>
+      <w:r>
+        <w:t xml:space="preserve">clear </w:t>
+      </w:r>
+      <w:proofErr w:type="spellStart"/>
+      <w:r>
+        <w:t>arr</w:t>
+      </w:r>
+      <w:proofErr w:type="spellEnd"/>
+    </w:p>
+    <w:p>
+      <w:r>
+        <w:rPr>
+          <w:b/>
+          <w:bCs/>
+        </w:rPr>
+        <w:t>Load</w:t>
+      </w:r>
+      <w:r>
+        <w:t xml:space="preserve"> -&gt; reads a data set from a file into an array.</w:t>
+      </w:r>
+    </w:p>
+    <w:p>
+      <w:r>
+        <w:t>load data "scores.csv"</w:t>
+      </w:r>
+    </w:p>
+    <w:p>
+      <w:r>
+        <w:rPr>
+          <w:b/>
+          <w:bCs/>
+        </w:rPr>
+        <w:t>Save</w:t>
+      </w:r>
+      <w:r>
+        <w:t xml:space="preserve"> -&gt; writes the result to a file.</w:t>
+      </w:r>
+    </w:p>
+    <w:p>
+      <w:r>
+        <w:t>save data "clean.csv"</w:t>
+      </w:r>
+    </w:p>
+    <w:p>
+      <w:r>
+        <w:rPr>
+          <w:b/>
+          <w:bCs/>
+        </w:rPr>
+        <w:t>size</w:t>
+      </w:r>
+      <w:r>
+        <w:t xml:space="preserve"> -&gt; gives the number of elements.</w:t>
+      </w:r>
+    </w:p>
+    <w:p>
+      <w:r>
+        <w:t>n = size(</w:t>
+      </w:r>
+      <w:proofErr w:type="spellStart"/>
+      <w:r>
+        <w:t>arr</w:t>
+      </w:r>
+      <w:proofErr w:type="spellEnd"/>
+      <w:r>
+        <w:t>)</w:t>
+      </w:r>
+    </w:p>
+    <w:p>
+      <w:r>
+        <w:rPr>
+          <w:b/>
+          <w:bCs/>
+        </w:rPr>
+        <w:t>sum</w:t>
+      </w:r>
+      <w:r>
+        <w:t xml:space="preserve"> -&gt; adds all elements, for totals.</w:t>
+      </w:r>
+    </w:p>
+    <w:p>
+      <w:r>
+        <w:t>total = sum(</w:t>
+      </w:r>
+      <w:proofErr w:type="spellStart"/>
+      <w:r>
+        <w:t>arr</w:t>
+      </w:r>
+      <w:proofErr w:type="spellEnd"/>
+      <w:r>
+        <w:t>)</w:t>
+      </w:r>
+    </w:p>
+    <w:p>
+      <w:r>
+        <w:rPr>
+          <w:b/>
+          <w:bCs/>
+        </w:rPr>
         <w:lastRenderedPageBreak/>
-        <w:t>Reverse</w:t>
-      </w:r>
-      <w:r>
-        <w:t xml:space="preserve"> -&gt; flips the order of the elements.</w:t>
-      </w:r>
-    </w:p>
-    <w:p>
-      <w:r>
-        <w:t xml:space="preserve">reverse </w:t>
+        <w:t>min</w:t>
+      </w:r>
+      <w:r>
+        <w:t xml:space="preserve"> -&gt; finds the smallest value.</w:t>
+      </w:r>
+    </w:p>
+    <w:p>
+      <w:r>
+        <w:t>low = min(</w:t>
       </w:r>
       <w:proofErr w:type="spellStart"/>
       <w:r>
         <w:t>arr</w:t>
       </w:r>
       <w:proofErr w:type="spellEnd"/>
-    </w:p>
-    <w:p>
-      <w:r>
-        <w:rPr>
-          <w:b/>
-          <w:bCs/>
-        </w:rPr>
-        <w:t>Append</w:t>
-      </w:r>
-      <w:r>
-        <w:t xml:space="preserve"> -&gt; adds new values at the end as they arrive.</w:t>
-      </w:r>
-    </w:p>
-    <w:p>
-      <w:proofErr w:type="spellStart"/>
+      <w:r>
+        <w:t>)</w:t>
+      </w:r>
+    </w:p>
+    <w:p>
+      <w:r>
+        <w:rPr>
+          <w:b/>
+          <w:bCs/>
+        </w:rPr>
+        <w:t>max</w:t>
+      </w:r>
+      <w:r>
+        <w:t xml:space="preserve"> -&gt; finds the largest value.</w:t>
+      </w:r>
+    </w:p>
+    <w:p>
+      <w:r>
+        <w:t>high = max(</w:t>
+      </w:r>
+      <w:proofErr w:type="spellStart"/>
+      <w:r>
+        <w:t>arr</w:t>
+      </w:r>
+      <w:proofErr w:type="spellEnd"/>
+      <w:r>
+        <w:t>)</w:t>
+      </w:r>
+    </w:p>
+    <w:p>
+      <w:r>
+        <w:rPr>
+          <w:b/>
+          <w:bCs/>
+        </w:rPr>
+        <w:t>count</w:t>
+      </w:r>
+      <w:r>
+        <w:t xml:space="preserve"> -&gt; counts how many times a value appears.</w:t>
+      </w:r>
+    </w:p>
+    <w:p>
+      <w:r>
+        <w:t xml:space="preserve">c = </w:t>
+      </w:r>
       <w:proofErr w:type="gramStart"/>
       <w:r>
-        <w:t>arr.append</w:t>
-      </w:r>
-      <w:proofErr w:type="spellEnd"/>
+        <w:t>count(</w:t>
+      </w:r>
+      <w:proofErr w:type="spellStart"/>
       <w:proofErr w:type="gramEnd"/>
       <w:r>
-        <w:t>(7)</w:t>
-      </w:r>
-    </w:p>
-    <w:p>
-      <w:r>
-        <w:rPr>
-          <w:b/>
-          <w:bCs/>
-        </w:rPr>
-        <w:t>Insert</w:t>
-      </w:r>
-      <w:r>
-        <w:t xml:space="preserve"> -&gt; puts a value at a given position.</w:t>
-      </w:r>
-    </w:p>
-    <w:p>
-      <w:r>
-        <w:t xml:space="preserve">insert </w:t>
-      </w:r>
-      <w:proofErr w:type="spellStart"/>
-      <w:r>
         <w:t>arr</w:t>
       </w:r>
       <w:proofErr w:type="spellEnd"/>
       <w:r>
-        <w:t xml:space="preserve"> 1 99</w:t>
-      </w:r>
-    </w:p>
-    <w:p>
-      <w:r>
-        <w:rPr>
-          <w:b/>
-          <w:bCs/>
-        </w:rPr>
-        <w:t>Remove</w:t>
-      </w:r>
-      <w:r>
-        <w:t xml:space="preserve"> -&gt; deletes the element at a given position.</w:t>
-      </w:r>
-    </w:p>
-    <w:p>
-      <w:r>
-        <w:t xml:space="preserve">remove </w:t>
+        <w:t>, 3)</w:t>
+      </w:r>
+    </w:p>
+    <w:p>
+      <w:proofErr w:type="spellStart"/>
+      <w:r>
+        <w:rPr>
+          <w:b/>
+          <w:bCs/>
+        </w:rPr>
+        <w:t>isEmpty</w:t>
+      </w:r>
+      <w:proofErr w:type="spellEnd"/>
+      <w:r>
+        <w:t xml:space="preserve"> -&gt; checks for an empty array. It is used only inside conditions.</w:t>
+      </w:r>
+    </w:p>
+    <w:p>
+      <w:r>
+        <w:t xml:space="preserve">if </w:t>
+      </w:r>
+      <w:proofErr w:type="spellStart"/>
+      <w:r>
+        <w:t>isEmpty</w:t>
+      </w:r>
+      <w:proofErr w:type="spellEnd"/>
+      <w:r>
+        <w:t>(</w:t>
       </w:r>
       <w:proofErr w:type="spellStart"/>
       <w:r>
@@ -397,286 +702,88 @@
       </w:r>
       <w:proofErr w:type="spellEnd"/>
       <w:r>
-        <w:t xml:space="preserve"> 0</w:t>
-      </w:r>
-    </w:p>
-    <w:p>
-      <w:proofErr w:type="spellStart"/>
-      <w:r>
-        <w:rPr>
-          <w:b/>
-          <w:bCs/>
-        </w:rPr>
-        <w:t>Concat</w:t>
-      </w:r>
-      <w:proofErr w:type="spellEnd"/>
-      <w:r>
-        <w:t xml:space="preserve"> -&gt; adds all elements of b to the end of a, to merge two data sets.</w:t>
-      </w:r>
-    </w:p>
-    <w:p>
-      <w:proofErr w:type="spellStart"/>
-      <w:r>
-        <w:t>concat</w:t>
-      </w:r>
-      <w:proofErr w:type="spellEnd"/>
-      <w:r>
-        <w:t xml:space="preserve"> a b</w:t>
-      </w:r>
-    </w:p>
-    <w:p>
-      <w:r>
-        <w:rPr>
-          <w:b/>
-          <w:bCs/>
-        </w:rPr>
-        <w:t>Copy</w:t>
-      </w:r>
-      <w:r>
-        <w:t xml:space="preserve"> -&gt; copies </w:t>
-      </w:r>
-      <w:proofErr w:type="spellStart"/>
-      <w:r>
-        <w:t>a</w:t>
-      </w:r>
-      <w:proofErr w:type="spellEnd"/>
-      <w:r>
-        <w:t xml:space="preserve"> into b, so the original stays safe.</w:t>
-      </w:r>
-    </w:p>
-    <w:p>
-      <w:r>
-        <w:t>copy a b</w:t>
-      </w:r>
-    </w:p>
-    <w:p>
-      <w:r>
-        <w:rPr>
-          <w:b/>
-          <w:bCs/>
-        </w:rPr>
-        <w:t>Clear</w:t>
-      </w:r>
-      <w:r>
-        <w:t xml:space="preserve"> -&gt; empties an array so it can be reused.</w:t>
-      </w:r>
-    </w:p>
-    <w:p>
-      <w:r>
-        <w:t xml:space="preserve">clear </w:t>
-      </w:r>
-      <w:proofErr w:type="spellStart"/>
+        <w:t>)</w:t>
+      </w:r>
+      <w:proofErr w:type="gramStart"/>
+      <w:r>
+        <w:t>:  out</w:t>
+      </w:r>
+      <w:proofErr w:type="gramEnd"/>
+      <w:r>
+        <w:t xml:space="preserve"> "No data" </w:t>
+      </w:r>
+    </w:p>
+    <w:p>
+      <w:proofErr w:type="spellStart"/>
+      <w:r>
+        <w:rPr>
+          <w:b/>
+          <w:bCs/>
+        </w:rPr>
+        <w:t>getIndex</w:t>
+      </w:r>
+      <w:proofErr w:type="spellEnd"/>
+      <w:r>
+        <w:rPr>
+          <w:b/>
+          <w:bCs/>
+        </w:rPr>
+        <w:t xml:space="preserve"> </w:t>
+      </w:r>
+      <w:r>
+        <w:t>-&gt; return</w:t>
+      </w:r>
+      <w:r>
+        <w:t>s</w:t>
+      </w:r>
+      <w:r>
+        <w:t xml:space="preserve"> the index of an element in an </w:t>
+      </w:r>
+      <w:proofErr w:type="spellStart"/>
+      <w:proofErr w:type="gramStart"/>
+      <w:r>
+        <w:t>array,if</w:t>
+      </w:r>
+      <w:proofErr w:type="spellEnd"/>
+      <w:proofErr w:type="gramEnd"/>
+      <w:r>
+        <w:t xml:space="preserve"> the element is not found it returns -1.</w:t>
+      </w:r>
+    </w:p>
+    <w:p>
+      <w:proofErr w:type="gramStart"/>
+      <w:r>
+        <w:t>Index  =</w:t>
+      </w:r>
+      <w:proofErr w:type="gramEnd"/>
+      <w:r>
+        <w:t xml:space="preserve"> </w:t>
+      </w:r>
+      <w:proofErr w:type="spellStart"/>
+      <w:proofErr w:type="gramStart"/>
+      <w:r>
+        <w:t>getIndex</w:t>
+      </w:r>
+      <w:proofErr w:type="spellEnd"/>
+      <w:r>
+        <w:t>(</w:t>
+      </w:r>
+      <w:proofErr w:type="spellStart"/>
+      <w:proofErr w:type="gramEnd"/>
       <w:r>
         <w:t>arr</w:t>
       </w:r>
       <w:proofErr w:type="spellEnd"/>
-    </w:p>
-    <w:p>
-      <w:r>
-        <w:rPr>
-          <w:b/>
-          <w:bCs/>
-        </w:rPr>
-        <w:t>Load</w:t>
-      </w:r>
-      <w:r>
-        <w:t xml:space="preserve"> -&gt; reads a data set from a file into an array.</w:t>
-      </w:r>
-    </w:p>
-    <w:p>
-      <w:r>
-        <w:t>load data "scores.csv"</w:t>
-      </w:r>
-    </w:p>
-    <w:p>
-      <w:r>
-        <w:rPr>
-          <w:b/>
-          <w:bCs/>
-        </w:rPr>
-        <w:t>Save</w:t>
-      </w:r>
-      <w:r>
-        <w:t xml:space="preserve"> -&gt; writes the result to a file.</w:t>
-      </w:r>
-    </w:p>
-    <w:p>
-      <w:r>
-        <w:t>save data "clean.csv"</w:t>
-      </w:r>
-    </w:p>
-    <w:p>
-      <w:r>
-        <w:rPr>
-          <w:b/>
-          <w:bCs/>
-        </w:rPr>
-        <w:t>size</w:t>
-      </w:r>
-      <w:r>
-        <w:t xml:space="preserve"> -&gt; gives the number of elements.</w:t>
-      </w:r>
-    </w:p>
-    <w:p>
-      <w:r>
-        <w:t>n = size(</w:t>
-      </w:r>
-      <w:proofErr w:type="spellStart"/>
-      <w:r>
-        <w:t>arr</w:t>
+      <w:r>
+        <w:t xml:space="preserve">, </w:t>
+      </w:r>
+      <w:proofErr w:type="spellStart"/>
+      <w:r>
+        <w:t>elem</w:t>
       </w:r>
       <w:proofErr w:type="spellEnd"/>
       <w:r>
         <w:t>)</w:t>
-      </w:r>
-    </w:p>
-    <w:p>
-      <w:r>
-        <w:rPr>
-          <w:b/>
-          <w:bCs/>
-        </w:rPr>
-        <w:t>sum</w:t>
-      </w:r>
-      <w:r>
-        <w:t xml:space="preserve"> -&gt; adds all elements, for totals.</w:t>
-      </w:r>
-    </w:p>
-    <w:p>
-      <w:r>
-        <w:t>total = sum(</w:t>
-      </w:r>
-      <w:proofErr w:type="spellStart"/>
-      <w:r>
-        <w:t>arr</w:t>
-      </w:r>
-      <w:proofErr w:type="spellEnd"/>
-      <w:r>
-        <w:t>)</w:t>
-      </w:r>
-    </w:p>
-    <w:p>
-      <w:r>
-        <w:rPr>
-          <w:b/>
-          <w:bCs/>
-        </w:rPr>
-        <w:t>min</w:t>
-      </w:r>
-      <w:r>
-        <w:t xml:space="preserve"> -&gt; finds the smallest value.</w:t>
-      </w:r>
-    </w:p>
-    <w:p>
-      <w:r>
-        <w:t>low = min(</w:t>
-      </w:r>
-      <w:proofErr w:type="spellStart"/>
-      <w:r>
-        <w:t>arr</w:t>
-      </w:r>
-      <w:proofErr w:type="spellEnd"/>
-      <w:r>
-        <w:t>)</w:t>
-      </w:r>
-    </w:p>
-    <w:p>
-      <w:r>
-        <w:rPr>
-          <w:b/>
-          <w:bCs/>
-        </w:rPr>
-        <w:t>max</w:t>
-      </w:r>
-      <w:r>
-        <w:t xml:space="preserve"> -&gt; finds the largest value.</w:t>
-      </w:r>
-    </w:p>
-    <w:p>
-      <w:r>
-        <w:t>high = max(</w:t>
-      </w:r>
-      <w:proofErr w:type="spellStart"/>
-      <w:r>
-        <w:t>arr</w:t>
-      </w:r>
-      <w:proofErr w:type="spellEnd"/>
-      <w:r>
-        <w:t>)</w:t>
-      </w:r>
-    </w:p>
-    <w:p>
-      <w:r>
-        <w:rPr>
-          <w:b/>
-          <w:bCs/>
-        </w:rPr>
-        <w:lastRenderedPageBreak/>
-        <w:t>count</w:t>
-      </w:r>
-      <w:r>
-        <w:t xml:space="preserve"> -&gt; counts how many times a value appears.</w:t>
-      </w:r>
-    </w:p>
-    <w:p>
-      <w:r>
-        <w:t xml:space="preserve">c = </w:t>
-      </w:r>
-      <w:proofErr w:type="gramStart"/>
-      <w:r>
-        <w:t>count(</w:t>
-      </w:r>
-      <w:proofErr w:type="spellStart"/>
-      <w:proofErr w:type="gramEnd"/>
-      <w:r>
-        <w:t>arr</w:t>
-      </w:r>
-      <w:proofErr w:type="spellEnd"/>
-      <w:r>
-        <w:t>, 3)</w:t>
-      </w:r>
-    </w:p>
-    <w:p>
-      <w:proofErr w:type="spellStart"/>
-      <w:r>
-        <w:rPr>
-          <w:b/>
-          <w:bCs/>
-        </w:rPr>
-        <w:t>isEmpty</w:t>
-      </w:r>
-      <w:proofErr w:type="spellEnd"/>
-      <w:r>
-        <w:t xml:space="preserve"> -&gt; checks for an empty array. It is used only inside conditions.</w:t>
-      </w:r>
-    </w:p>
-    <w:p>
-      <w:r>
-        <w:t xml:space="preserve">if </w:t>
-      </w:r>
-      <w:proofErr w:type="spellStart"/>
-      <w:r>
-        <w:t>isEmpty</w:t>
-      </w:r>
-      <w:proofErr w:type="spellEnd"/>
-      <w:r>
-        <w:t>(</w:t>
-      </w:r>
-      <w:proofErr w:type="spellStart"/>
-      <w:r>
-        <w:t>arr</w:t>
-      </w:r>
-      <w:proofErr w:type="spellEnd"/>
-      <w:r>
-        <w:t>)</w:t>
-      </w:r>
-      <w:proofErr w:type="gramStart"/>
-      <w:r>
-        <w:t>:  out</w:t>
-      </w:r>
-      <w:proofErr w:type="gramEnd"/>
-      <w:r>
-        <w:t xml:space="preserve"> "No data" </w:t>
       </w:r>
     </w:p>
     <w:p/>
@@ -1943,23 +2050,6 @@
 </file>
 
 <file path=customXml/item1.xml><?xml version="1.0" encoding="utf-8"?>
-<p:properties xmlns:p="http://schemas.microsoft.com/office/2006/metadata/properties" xmlns:xsi="http://www.w3.org/2001/XMLSchema-instance" xmlns:pc="http://schemas.microsoft.com/office/infopath/2007/PartnerControls">
-  <documentManagement>
-    <_activity xmlns="31c165dd-1579-41dd-b5d5-97781eae4bed" xsi:nil="true"/>
-  </documentManagement>
-</p:properties>
-</file>
-
-<file path=customXml/item2.xml><?xml version="1.0" encoding="utf-8"?>
-<?mso-contentType ?>
-<FormTemplates xmlns="http://schemas.microsoft.com/sharepoint/v3/contenttype/forms">
-  <Display>DocumentLibraryForm</Display>
-  <Edit>DocumentLibraryForm</Edit>
-  <New>DocumentLibraryForm</New>
-</FormTemplates>
-</file>
-
-<file path=customXml/item3.xml><?xml version="1.0" encoding="utf-8"?>
 <ct:contentTypeSchema xmlns:ct="http://schemas.microsoft.com/office/2006/metadata/contentType" xmlns:ma="http://schemas.microsoft.com/office/2006/metadata/properties/metaAttributes" ct:_="" ma:_="" ma:contentTypeName="Document" ma:contentTypeID="0x010100506FF9090A9C414584E27653DF7152B3" ma:contentTypeVersion="11" ma:contentTypeDescription="Create a new document." ma:contentTypeScope="" ma:versionID="8aa34cdeb66d9cac34d70b8f1f0b207b">
   <xsd:schema xmlns:xsd="http://www.w3.org/2001/XMLSchema" xmlns:xs="http://www.w3.org/2001/XMLSchema" xmlns:p="http://schemas.microsoft.com/office/2006/metadata/properties" xmlns:ns3="31c165dd-1579-41dd-b5d5-97781eae4bed" targetNamespace="http://schemas.microsoft.com/office/2006/metadata/properties" ma:root="true" ma:fieldsID="fcd88102d50390d4284c2f4af2328ad5" ns3:_="">
     <xsd:import namespace="31c165dd-1579-41dd-b5d5-97781eae4bed"/>
@@ -2147,25 +2237,24 @@
 </ct:contentTypeSchema>
 </file>
 
-<file path=customXml/itemProps1.xml><?xml version="1.0" encoding="utf-8"?>
-<ds:datastoreItem xmlns:ds="http://schemas.openxmlformats.org/officeDocument/2006/customXml" ds:itemID="{EFFAFEF9-12CC-47B8-B830-A230693779ED}">
-  <ds:schemaRefs>
-    <ds:schemaRef ds:uri="http://schemas.microsoft.com/office/2006/metadata/properties"/>
-    <ds:schemaRef ds:uri="http://schemas.microsoft.com/office/infopath/2007/PartnerControls"/>
-    <ds:schemaRef ds:uri="31c165dd-1579-41dd-b5d5-97781eae4bed"/>
-  </ds:schemaRefs>
-</ds:datastoreItem>
+<file path=customXml/item2.xml><?xml version="1.0" encoding="utf-8"?>
+<?mso-contentType ?>
+<FormTemplates xmlns="http://schemas.microsoft.com/sharepoint/v3/contenttype/forms">
+  <Display>DocumentLibraryForm</Display>
+  <Edit>DocumentLibraryForm</Edit>
+  <New>DocumentLibraryForm</New>
+</FormTemplates>
 </file>
 
-<file path=customXml/itemProps2.xml><?xml version="1.0" encoding="utf-8"?>
-<ds:datastoreItem xmlns:ds="http://schemas.openxmlformats.org/officeDocument/2006/customXml" ds:itemID="{BEFB8CD2-8165-405D-8D80-F85F8DA3C4E3}">
-  <ds:schemaRefs>
-    <ds:schemaRef ds:uri="http://schemas.microsoft.com/sharepoint/v3/contenttype/forms"/>
-  </ds:schemaRefs>
-</ds:datastoreItem>
+<file path=customXml/item3.xml><?xml version="1.0" encoding="utf-8"?>
+<p:properties xmlns:p="http://schemas.microsoft.com/office/2006/metadata/properties" xmlns:xsi="http://www.w3.org/2001/XMLSchema-instance" xmlns:pc="http://schemas.microsoft.com/office/infopath/2007/PartnerControls">
+  <documentManagement>
+    <_activity xmlns="31c165dd-1579-41dd-b5d5-97781eae4bed" xsi:nil="true"/>
+  </documentManagement>
+</p:properties>
 </file>
 
-<file path=customXml/itemProps3.xml><?xml version="1.0" encoding="utf-8"?>
+<file path=customXml/itemProps1.xml><?xml version="1.0" encoding="utf-8"?>
 <ds:datastoreItem xmlns:ds="http://schemas.openxmlformats.org/officeDocument/2006/customXml" ds:itemID="{382D0BD1-7D9D-49B0-8406-6633F7DEAA48}">
   <ds:schemaRefs>
     <ds:schemaRef ds:uri="http://schemas.microsoft.com/office/2006/metadata/contentType"/>
@@ -2181,4 +2270,22 @@
     <ds:schemaRef ds:uri="http://schemas.microsoft.com/internal/obd"/>
   </ds:schemaRefs>
 </ds:datastoreItem>
+</file>
+
+<file path=customXml/itemProps2.xml><?xml version="1.0" encoding="utf-8"?>
+<ds:datastoreItem xmlns:ds="http://schemas.openxmlformats.org/officeDocument/2006/customXml" ds:itemID="{BEFB8CD2-8165-405D-8D80-F85F8DA3C4E3}">
+  <ds:schemaRefs>
+    <ds:schemaRef ds:uri="http://schemas.microsoft.com/sharepoint/v3/contenttype/forms"/>
+  </ds:schemaRefs>
+</ds:datastoreItem>
+</file>
+
+<file path=customXml/itemProps3.xml><?xml version="1.0" encoding="utf-8"?>
+<ds:datastoreItem xmlns:ds="http://schemas.openxmlformats.org/officeDocument/2006/customXml" ds:itemID="{EFFAFEF9-12CC-47B8-B830-A230693779ED}">
+  <ds:schemaRefs>
+    <ds:schemaRef ds:uri="http://schemas.microsoft.com/office/2006/metadata/properties"/>
+    <ds:schemaRef ds:uri="http://schemas.microsoft.com/office/infopath/2007/PartnerControls"/>
+    <ds:schemaRef ds:uri="31c165dd-1579-41dd-b5d5-97781eae4bed"/>
+  </ds:schemaRefs>
+</ds:datastoreItem>
 </file>
</xml_diff>